<commit_message>
Reemplazar la tabla de contenido dinámica por enlaces fijos
La tabla de contenido usaba un campo de Word que requiere "actualizar
campo" para llenarse; en Word Online esa acción no funcionaba y la
tabla quedaba vacía. Se reemplaza por una lista de enlaces internos
que apuntan directamente a cada sección mediante marcadores, visible
de inmediato sin ninguna acción manual, en cualquier editor (Word de
escritorio, Word Online, LibreOffice).

Co-Authored-By: Claude Sonnet 5 <noreply@anthropic.com>
Claude-Session: https://claude.ai/code/session_01Rs2NPxpervDRkKb3pbe6kR
</commit_message>
<xml_diff>
--- a/docs/Sistema_Inventario_CRB.docx
+++ b/docs/Sistema_Inventario_CRB.docx
@@ -144,7 +144,7 @@
     <w:p>
       <w:pPr>
         <w:pStyle w:val="Heading1"/>
-        <w:spacing w:after="160"/>
+        <w:spacing w:after="240"/>
       </w:pPr>
       <w:r>
         <w:rPr>
@@ -159,38 +159,344 @@
     </w:p>
     <w:p>
       <w:pPr>
-        <w:spacing w:after="240"/>
-      </w:pPr>
-      <w:r>
-        <w:rPr>
-          <w:i/>
-          <w:iCs/>
-          <w:color w:val="5b6058"/>
-          <w:sz w:val="18"/>
-          <w:szCs w:val="18"/>
-        </w:rPr>
-        <w:t xml:space="preserve">(Clic derecho sobre la tabla → "Actualizar campo" para que aparezcan los números de página)</w:t>
-      </w:r>
-    </w:p>
-    <w:sdt>
-      <w:sdtPr>
-        <w:alias w:val="Tabla de contenido"/>
-      </w:sdtPr>
-      <w:sdtContent>
-        <w:p>
-          <w:r>
-            <w:fldChar w:fldCharType="begin" w:dirty="true"/>
-            <w:instrText xml:space="preserve">TOC \h \o "1-3"</w:instrText>
-            <w:fldChar w:fldCharType="separate"/>
-          </w:r>
-        </w:p>
-        <w:p>
-          <w:r>
-            <w:fldChar w:fldCharType="end"/>
-          </w:r>
-        </w:p>
-      </w:sdtContent>
-    </w:sdt>
+        <w:spacing w:after="70"/>
+        <w:ind w:left="0"/>
+      </w:pPr>
+      <w:hyperlink w:history="1" w:anchor="sec1">
+        <w:r>
+          <w:rPr>
+            <w:color w:val="1155cc"/>
+            <w:sz w:val="22"/>
+            <w:szCs w:val="22"/>
+            <w:u w:val="single"/>
+          </w:rPr>
+          <w:t xml:space="preserve">1. Título</w:t>
+        </w:r>
+      </w:hyperlink>
+    </w:p>
+    <w:p>
+      <w:pPr>
+        <w:spacing w:after="70"/>
+        <w:ind w:left="0"/>
+      </w:pPr>
+      <w:hyperlink w:history="1" w:anchor="sec2">
+        <w:r>
+          <w:rPr>
+            <w:color w:val="1155cc"/>
+            <w:sz w:val="22"/>
+            <w:szCs w:val="22"/>
+            <w:u w:val="single"/>
+          </w:rPr>
+          <w:t xml:space="preserve">2. Objetivo principal</w:t>
+        </w:r>
+      </w:hyperlink>
+    </w:p>
+    <w:p>
+      <w:pPr>
+        <w:spacing w:after="70"/>
+        <w:ind w:left="0"/>
+      </w:pPr>
+      <w:hyperlink w:history="1" w:anchor="sec3">
+        <w:r>
+          <w:rPr>
+            <w:color w:val="1155cc"/>
+            <w:sz w:val="22"/>
+            <w:szCs w:val="22"/>
+            <w:u w:val="single"/>
+          </w:rPr>
+          <w:t xml:space="preserve">3. Objetivos específicos</w:t>
+        </w:r>
+      </w:hyperlink>
+    </w:p>
+    <w:p>
+      <w:pPr>
+        <w:spacing w:after="70"/>
+        <w:ind w:left="0"/>
+      </w:pPr>
+      <w:hyperlink w:history="1" w:anchor="sec4">
+        <w:r>
+          <w:rPr>
+            <w:color w:val="1155cc"/>
+            <w:sz w:val="22"/>
+            <w:szCs w:val="22"/>
+            <w:u w:val="single"/>
+          </w:rPr>
+          <w:t xml:space="preserve">4. Introducción</w:t>
+        </w:r>
+      </w:hyperlink>
+    </w:p>
+    <w:p>
+      <w:pPr>
+        <w:spacing w:after="70"/>
+        <w:ind w:left="0"/>
+      </w:pPr>
+      <w:hyperlink w:history="1" w:anchor="sec5">
+        <w:r>
+          <w:rPr>
+            <w:color w:val="1155cc"/>
+            <w:sz w:val="22"/>
+            <w:szCs w:val="22"/>
+            <w:u w:val="single"/>
+          </w:rPr>
+          <w:t xml:space="preserve">5. Alcance</w:t>
+        </w:r>
+      </w:hyperlink>
+    </w:p>
+    <w:p>
+      <w:pPr>
+        <w:spacing w:after="70"/>
+        <w:ind w:left="400"/>
+      </w:pPr>
+      <w:hyperlink w:history="1" w:anchor="sec5incluye">
+        <w:r>
+          <w:rPr>
+            <w:color w:val="1155cc"/>
+            <w:sz w:val="22"/>
+            <w:szCs w:val="22"/>
+            <w:u w:val="single"/>
+          </w:rPr>
+          <w:t xml:space="preserve">Incluye</w:t>
+        </w:r>
+      </w:hyperlink>
+    </w:p>
+    <w:p>
+      <w:pPr>
+        <w:spacing w:after="70"/>
+        <w:ind w:left="400"/>
+      </w:pPr>
+      <w:hyperlink w:history="1" w:anchor="sec5noincluye">
+        <w:r>
+          <w:rPr>
+            <w:color w:val="1155cc"/>
+            <w:sz w:val="22"/>
+            <w:szCs w:val="22"/>
+            <w:u w:val="single"/>
+          </w:rPr>
+          <w:t xml:space="preserve">No incluye (en esta primera fase)</w:t>
+        </w:r>
+      </w:hyperlink>
+    </w:p>
+    <w:p>
+      <w:pPr>
+        <w:spacing w:after="70"/>
+        <w:ind w:left="0"/>
+      </w:pPr>
+      <w:hyperlink w:history="1" w:anchor="sec6">
+        <w:r>
+          <w:rPr>
+            <w:color w:val="1155cc"/>
+            <w:sz w:val="22"/>
+            <w:szCs w:val="22"/>
+            <w:u w:val="single"/>
+          </w:rPr>
+          <w:t xml:space="preserve">6. Problema</w:t>
+        </w:r>
+      </w:hyperlink>
+    </w:p>
+    <w:p>
+      <w:pPr>
+        <w:spacing w:after="70"/>
+        <w:ind w:left="0"/>
+      </w:pPr>
+      <w:hyperlink w:history="1" w:anchor="sec7">
+        <w:r>
+          <w:rPr>
+            <w:color w:val="1155cc"/>
+            <w:sz w:val="22"/>
+            <w:szCs w:val="22"/>
+            <w:u w:val="single"/>
+          </w:rPr>
+          <w:t xml:space="preserve">7. Levantamiento de requerimientos funcionales y no funcionales</w:t>
+        </w:r>
+      </w:hyperlink>
+    </w:p>
+    <w:p>
+      <w:pPr>
+        <w:spacing w:after="70"/>
+        <w:ind w:left="400"/>
+      </w:pPr>
+      <w:hyperlink w:history="1" w:anchor="sec7rf">
+        <w:r>
+          <w:rPr>
+            <w:color w:val="1155cc"/>
+            <w:sz w:val="22"/>
+            <w:szCs w:val="22"/>
+            <w:u w:val="single"/>
+          </w:rPr>
+          <w:t xml:space="preserve">Requerimientos funcionales</w:t>
+        </w:r>
+      </w:hyperlink>
+    </w:p>
+    <w:p>
+      <w:pPr>
+        <w:spacing w:after="70"/>
+        <w:ind w:left="400"/>
+      </w:pPr>
+      <w:hyperlink w:history="1" w:anchor="sec7rnf">
+        <w:r>
+          <w:rPr>
+            <w:color w:val="1155cc"/>
+            <w:sz w:val="22"/>
+            <w:szCs w:val="22"/>
+            <w:u w:val="single"/>
+          </w:rPr>
+          <w:t xml:space="preserve">Requerimientos no funcionales</w:t>
+        </w:r>
+      </w:hyperlink>
+    </w:p>
+    <w:p>
+      <w:pPr>
+        <w:spacing w:after="70"/>
+        <w:ind w:left="0"/>
+      </w:pPr>
+      <w:hyperlink w:history="1" w:anchor="sec8">
+        <w:r>
+          <w:rPr>
+            <w:color w:val="1155cc"/>
+            <w:sz w:val="22"/>
+            <w:szCs w:val="22"/>
+            <w:u w:val="single"/>
+          </w:rPr>
+          <w:t xml:space="preserve">8. Desarrollo</w:t>
+        </w:r>
+      </w:hyperlink>
+    </w:p>
+    <w:p>
+      <w:pPr>
+        <w:spacing w:after="70"/>
+        <w:ind w:left="400"/>
+      </w:pPr>
+      <w:hyperlink w:history="1" w:anchor="sec8_1">
+        <w:r>
+          <w:rPr>
+            <w:color w:val="1155cc"/>
+            <w:sz w:val="22"/>
+            <w:szCs w:val="22"/>
+            <w:u w:val="single"/>
+          </w:rPr>
+          <w:t xml:space="preserve">8.1 Explicación</w:t>
+        </w:r>
+      </w:hyperlink>
+    </w:p>
+    <w:p>
+      <w:pPr>
+        <w:spacing w:after="70"/>
+        <w:ind w:left="400"/>
+      </w:pPr>
+      <w:hyperlink w:history="1" w:anchor="sec8_2">
+        <w:r>
+          <w:rPr>
+            <w:color w:val="1155cc"/>
+            <w:sz w:val="22"/>
+            <w:szCs w:val="22"/>
+            <w:u w:val="single"/>
+          </w:rPr>
+          <w:t xml:space="preserve">8.2 Diagramas</w:t>
+        </w:r>
+      </w:hyperlink>
+    </w:p>
+    <w:p>
+      <w:pPr>
+        <w:spacing w:after="70"/>
+        <w:ind w:left="400"/>
+      </w:pPr>
+      <w:hyperlink w:history="1" w:anchor="sec8_3">
+        <w:r>
+          <w:rPr>
+            <w:color w:val="1155cc"/>
+            <w:sz w:val="22"/>
+            <w:szCs w:val="22"/>
+            <w:u w:val="single"/>
+          </w:rPr>
+          <w:t xml:space="preserve">8.3 Arquitectura y entorno</w:t>
+        </w:r>
+      </w:hyperlink>
+    </w:p>
+    <w:p>
+      <w:pPr>
+        <w:spacing w:after="70"/>
+        <w:ind w:left="0"/>
+      </w:pPr>
+      <w:hyperlink w:history="1" w:anchor="sec9">
+        <w:r>
+          <w:rPr>
+            <w:color w:val="1155cc"/>
+            <w:sz w:val="22"/>
+            <w:szCs w:val="22"/>
+            <w:u w:val="single"/>
+          </w:rPr>
+          <w:t xml:space="preserve">9. Anexo: código SQL comentado</w:t>
+        </w:r>
+      </w:hyperlink>
+    </w:p>
+    <w:p>
+      <w:pPr>
+        <w:spacing w:after="70"/>
+        <w:ind w:left="0"/>
+      </w:pPr>
+      <w:hyperlink w:history="1" w:anchor="sec10">
+        <w:r>
+          <w:rPr>
+            <w:color w:val="1155cc"/>
+            <w:sz w:val="22"/>
+            <w:szCs w:val="22"/>
+            <w:u w:val="single"/>
+          </w:rPr>
+          <w:t xml:space="preserve">10. Seguridad y mantenimiento: matriz de roles otorgados</w:t>
+        </w:r>
+      </w:hyperlink>
+    </w:p>
+    <w:p>
+      <w:pPr>
+        <w:spacing w:after="70"/>
+        <w:ind w:left="0"/>
+      </w:pPr>
+      <w:hyperlink w:history="1" w:anchor="sec11">
+        <w:r>
+          <w:rPr>
+            <w:color w:val="1155cc"/>
+            <w:sz w:val="22"/>
+            <w:szCs w:val="22"/>
+            <w:u w:val="single"/>
+          </w:rPr>
+          <w:t xml:space="preserve">11. Validación y pruebas: scripts de consultas</w:t>
+        </w:r>
+      </w:hyperlink>
+    </w:p>
+    <w:p>
+      <w:pPr>
+        <w:spacing w:after="70"/>
+        <w:ind w:left="0"/>
+      </w:pPr>
+      <w:hyperlink w:history="1" w:anchor="sec12">
+        <w:r>
+          <w:rPr>
+            <w:color w:val="1155cc"/>
+            <w:sz w:val="22"/>
+            <w:szCs w:val="22"/>
+            <w:u w:val="single"/>
+          </w:rPr>
+          <w:t xml:space="preserve">12. Imágenes de la interfaz</w:t>
+        </w:r>
+      </w:hyperlink>
+    </w:p>
+    <w:p>
+      <w:pPr>
+        <w:spacing w:after="70"/>
+        <w:ind w:left="0"/>
+      </w:pPr>
+      <w:hyperlink w:history="1" w:anchor="sec13">
+        <w:r>
+          <w:rPr>
+            <w:color w:val="1155cc"/>
+            <w:sz w:val="22"/>
+            <w:szCs w:val="22"/>
+            <w:u w:val="single"/>
+          </w:rPr>
+          <w:t xml:space="preserve">13. Conclusiones</w:t>
+        </w:r>
+      </w:hyperlink>
+    </w:p>
     <w:p>
       <w:r>
         <w:br w:type="page"/>
@@ -201,6 +507,7 @@
         <w:pStyle w:val="Heading1"/>
         <w:spacing w:after="200" w:before="400"/>
       </w:pPr>
+      <w:bookmarkStart w:name="sec1" w:id="1"/>
       <w:r>
         <w:rPr>
           <w:b/>
@@ -211,6 +518,7 @@
         </w:rPr>
         <w:t xml:space="preserve">1. Título</w:t>
       </w:r>
+      <w:bookmarkEnd w:id="1"/>
     </w:p>
     <w:p>
       <w:pPr>
@@ -230,6 +538,7 @@
         <w:pStyle w:val="Heading1"/>
         <w:spacing w:after="200" w:before="400"/>
       </w:pPr>
+      <w:bookmarkStart w:name="sec2" w:id="1"/>
       <w:r>
         <w:rPr>
           <w:b/>
@@ -240,6 +549,7 @@
         </w:rPr>
         <w:t xml:space="preserve">2. Objetivo principal</w:t>
       </w:r>
+      <w:bookmarkEnd w:id="1"/>
     </w:p>
     <w:p>
       <w:pPr>
@@ -259,6 +569,7 @@
         <w:pStyle w:val="Heading1"/>
         <w:spacing w:after="200" w:before="400"/>
       </w:pPr>
+      <w:bookmarkStart w:name="sec3" w:id="1"/>
       <w:r>
         <w:rPr>
           <w:b/>
@@ -269,6 +580,7 @@
         </w:rPr>
         <w:t xml:space="preserve">3. Objetivos específicos</w:t>
       </w:r>
+      <w:bookmarkEnd w:id="1"/>
     </w:p>
     <w:p>
       <w:pPr>
@@ -419,6 +731,7 @@
         <w:pStyle w:val="Heading1"/>
         <w:spacing w:after="200" w:before="400"/>
       </w:pPr>
+      <w:bookmarkStart w:name="sec4" w:id="1"/>
       <w:r>
         <w:rPr>
           <w:b/>
@@ -429,6 +742,7 @@
         </w:rPr>
         <w:t xml:space="preserve">4. Introducción</w:t>
       </w:r>
+      <w:bookmarkEnd w:id="1"/>
     </w:p>
     <w:p>
       <w:pPr>
@@ -474,6 +788,7 @@
         <w:pStyle w:val="Heading1"/>
         <w:spacing w:after="200" w:before="400"/>
       </w:pPr>
+      <w:bookmarkStart w:name="sec5" w:id="1"/>
       <w:r>
         <w:rPr>
           <w:b/>
@@ -484,12 +799,14 @@
         </w:rPr>
         <w:t xml:space="preserve">5. Alcance</w:t>
       </w:r>
+      <w:bookmarkEnd w:id="1"/>
     </w:p>
     <w:p>
       <w:pPr>
         <w:pStyle w:val="Heading2"/>
         <w:spacing w:after="140" w:before="280"/>
       </w:pPr>
+      <w:bookmarkStart w:name="sec5incluye" w:id="1"/>
       <w:r>
         <w:rPr>
           <w:b/>
@@ -500,6 +817,7 @@
         </w:rPr>
         <w:t xml:space="preserve">Incluye</w:t>
       </w:r>
+      <w:bookmarkEnd w:id="1"/>
     </w:p>
     <w:p>
       <w:pPr>
@@ -686,6 +1004,7 @@
         <w:pStyle w:val="Heading2"/>
         <w:spacing w:after="140" w:before="280"/>
       </w:pPr>
+      <w:bookmarkStart w:name="sec5noincluye" w:id="1"/>
       <w:r>
         <w:rPr>
           <w:b/>
@@ -696,6 +1015,7 @@
         </w:rPr>
         <w:t xml:space="preserve">No incluye (en esta primera fase)</w:t>
       </w:r>
+      <w:bookmarkEnd w:id="1"/>
     </w:p>
     <w:p>
       <w:pPr>
@@ -756,6 +1076,7 @@
         <w:pStyle w:val="Heading1"/>
         <w:spacing w:after="200" w:before="400"/>
       </w:pPr>
+      <w:bookmarkStart w:name="sec6" w:id="1"/>
       <w:r>
         <w:rPr>
           <w:b/>
@@ -766,6 +1087,7 @@
         </w:rPr>
         <w:t xml:space="preserve">6. Problema</w:t>
       </w:r>
+      <w:bookmarkEnd w:id="1"/>
     </w:p>
     <w:p>
       <w:pPr>
@@ -893,6 +1215,7 @@
         <w:pStyle w:val="Heading1"/>
         <w:spacing w:after="200" w:before="400"/>
       </w:pPr>
+      <w:bookmarkStart w:name="sec7" w:id="1"/>
       <w:r>
         <w:rPr>
           <w:b/>
@@ -903,12 +1226,14 @@
         </w:rPr>
         <w:t xml:space="preserve">7. Levantamiento de requerimientos funcionales y no funcionales</w:t>
       </w:r>
+      <w:bookmarkEnd w:id="1"/>
     </w:p>
     <w:p>
       <w:pPr>
         <w:pStyle w:val="Heading2"/>
         <w:spacing w:after="140" w:before="280"/>
       </w:pPr>
+      <w:bookmarkStart w:name="sec7rf" w:id="1"/>
       <w:r>
         <w:rPr>
           <w:b/>
@@ -919,6 +1244,7 @@
         </w:rPr>
         <w:t xml:space="preserve">Requerimientos funcionales</w:t>
       </w:r>
+      <w:bookmarkEnd w:id="1"/>
     </w:p>
     <w:tbl>
       <w:tblPr>
@@ -1578,6 +1904,7 @@
         <w:pStyle w:val="Heading2"/>
         <w:spacing w:after="140" w:before="280"/>
       </w:pPr>
+      <w:bookmarkStart w:name="sec7rnf" w:id="1"/>
       <w:r>
         <w:rPr>
           <w:b/>
@@ -1588,6 +1915,7 @@
         </w:rPr>
         <w:t xml:space="preserve">Requerimientos no funcionales</w:t>
       </w:r>
+      <w:bookmarkEnd w:id="1"/>
     </w:p>
     <w:tbl>
       <w:tblPr>
@@ -2002,6 +2330,7 @@
         <w:pStyle w:val="Heading1"/>
         <w:spacing w:after="200" w:before="400"/>
       </w:pPr>
+      <w:bookmarkStart w:name="sec8" w:id="1"/>
       <w:r>
         <w:rPr>
           <w:b/>
@@ -2012,12 +2341,14 @@
         </w:rPr>
         <w:t xml:space="preserve">8. Desarrollo</w:t>
       </w:r>
+      <w:bookmarkEnd w:id="1"/>
     </w:p>
     <w:p>
       <w:pPr>
         <w:pStyle w:val="Heading2"/>
         <w:spacing w:after="140" w:before="280"/>
       </w:pPr>
+      <w:bookmarkStart w:name="sec8_1" w:id="1"/>
       <w:r>
         <w:rPr>
           <w:b/>
@@ -2028,6 +2359,7 @@
         </w:rPr>
         <w:t xml:space="preserve">8.1 Explicación</w:t>
       </w:r>
+      <w:bookmarkEnd w:id="1"/>
     </w:p>
     <w:p>
       <w:pPr>
@@ -2112,6 +2444,7 @@
         <w:pStyle w:val="Heading2"/>
         <w:spacing w:after="140" w:before="280"/>
       </w:pPr>
+      <w:bookmarkStart w:name="sec8_2" w:id="1"/>
       <w:r>
         <w:rPr>
           <w:b/>
@@ -2122,6 +2455,7 @@
         </w:rPr>
         <w:t xml:space="preserve">8.2 Diagramas</w:t>
       </w:r>
+      <w:bookmarkEnd w:id="1"/>
     </w:p>
     <w:p>
       <w:pPr>
@@ -2310,6 +2644,7 @@
         <w:pStyle w:val="Heading2"/>
         <w:spacing w:after="140" w:before="280"/>
       </w:pPr>
+      <w:bookmarkStart w:name="sec8_3" w:id="1"/>
       <w:r>
         <w:rPr>
           <w:b/>
@@ -2320,6 +2655,7 @@
         </w:rPr>
         <w:t xml:space="preserve">8.3 Arquitectura y entorno</w:t>
       </w:r>
+      <w:bookmarkEnd w:id="1"/>
     </w:p>
     <w:p>
       <w:pPr>
@@ -2509,6 +2845,7 @@
         <w:pStyle w:val="Heading1"/>
         <w:spacing w:after="200" w:before="400"/>
       </w:pPr>
+      <w:bookmarkStart w:name="sec9" w:id="1"/>
       <w:r>
         <w:rPr>
           <w:b/>
@@ -2519,6 +2856,7 @@
         </w:rPr>
         <w:t xml:space="preserve">9. Anexo: código SQL comentado</w:t>
       </w:r>
+      <w:bookmarkEnd w:id="1"/>
     </w:p>
     <w:p>
       <w:pPr>
@@ -4322,6 +4660,7 @@
         <w:pStyle w:val="Heading1"/>
         <w:spacing w:after="200" w:before="400"/>
       </w:pPr>
+      <w:bookmarkStart w:name="sec10" w:id="1"/>
       <w:r>
         <w:rPr>
           <w:b/>
@@ -4332,6 +4671,7 @@
         </w:rPr>
         <w:t xml:space="preserve">10. Seguridad y mantenimiento: matriz de roles otorgados</w:t>
       </w:r>
+      <w:bookmarkEnd w:id="1"/>
     </w:p>
     <w:p>
       <w:pPr>
@@ -5455,6 +5795,7 @@
         <w:pStyle w:val="Heading1"/>
         <w:spacing w:after="200" w:before="400"/>
       </w:pPr>
+      <w:bookmarkStart w:name="sec11" w:id="1"/>
       <w:r>
         <w:rPr>
           <w:b/>
@@ -5465,6 +5806,7 @@
         </w:rPr>
         <w:t xml:space="preserve">11. Validación y pruebas: scripts de consultas</w:t>
       </w:r>
+      <w:bookmarkEnd w:id="1"/>
     </w:p>
     <w:p>
       <w:pPr>
@@ -6078,6 +6420,7 @@
         <w:pStyle w:val="Heading1"/>
         <w:spacing w:after="200" w:before="400"/>
       </w:pPr>
+      <w:bookmarkStart w:name="sec12" w:id="1"/>
       <w:r>
         <w:rPr>
           <w:b/>
@@ -6088,6 +6431,7 @@
         </w:rPr>
         <w:t xml:space="preserve">12. Imágenes de la interfaz</w:t>
       </w:r>
+      <w:bookmarkEnd w:id="1"/>
     </w:p>
     <w:p>
       <w:pPr>
@@ -6608,6 +6952,7 @@
         <w:pStyle w:val="Heading1"/>
         <w:spacing w:after="200" w:before="400"/>
       </w:pPr>
+      <w:bookmarkStart w:name="sec13" w:id="1"/>
       <w:r>
         <w:rPr>
           <w:b/>
@@ -6618,6 +6963,7 @@
         </w:rPr>
         <w:t xml:space="preserve">13. Conclusiones</w:t>
       </w:r>
+      <w:bookmarkEnd w:id="1"/>
     </w:p>
     <w:p>
       <w:pPr>

</xml_diff>